<commit_message>
added the test code
</commit_message>
<xml_diff>
--- a/Doc/Harness_Tester_Operation_Document_v1.4.docx
+++ b/Doc/Harness_Tester_Operation_Document_v1.4.docx
@@ -319,7 +319,7 @@
           <w:sz w:val="22"/>
           <w:szCs w:val="22"/>
         </w:rPr>
-        <w:t xml:space="preserve">4. The 0.01 % reference resistor cannot yet be used as a current reference. LO_SENSE taps the LO[j] harness pin, which sits ABOVE the low-side force multiplexer, so the ADC sees I × (R_LOmux + R131), not I × R131. Recommended fix: bring the LO_COM node itself to a spare analog input — AIN2–AIN5 are all free — so firmware can compute I = V_LO_COM / 100 Ω and evaluate R_wire ratiometrically. The alternative of wiring REFP0/REFN0 (currently flagged no-connect) across R131 only works if I × 100 Ω meets the ADC’s minimum external-reference voltage (of order 0.5 V), which 1 mA does not. See §7.2.</w:t>
+        <w:t xml:space="preserve">4. The 0.01 % reference resistor cannot yet be used as a current reference. LO_SENSE taps the LO[j] harness pin, which sits ABOVE the low-side force multiplexer, so the ADC sees I × (R_LOmux + R131), not I × R131. Recommended fix: bring the LO_COM node itself to a spare analog input — AIN2–AIN5 are all free — so firmware can compute I = V_LO_COM / 100 Ω and evaluate R_wire ratiometrically. The alternative of wiring REFP0/REFN0 (currently flagged no-connect) across R131 does not work: SBAS660C specifies a minimum differential external reference of 0.5 V, and 1 mA × 100 Ω = 100 mV falls well short. See §7.2.</w:t>
       </w:r>
     </w:p>
     <w:p>
@@ -1987,7 +1987,7 @@
         <w:t xml:space="preserve">FIRMWARE REVIEW NOTE (v1.4) — COMMON-MODE:</w:t>
       </w:r>
       <w:r>
-        <w:t xml:space="preserve"> R131 is doing two jobs. It is the intended current reference (0.01 % tolerance), and it lifts the sense nodes off ground so the ADC’s PGA sees a legal input. The ADS124S08 runs unipolar here (AVDD = +3V3, AVSS = GND) and its PGA needs roughly 150 mV of headroom from each rail, widened by |V_IN| × (Gain − 1) / 2 — check the datasheet formula. At 1 mA the LO_SENSE node sits at I × (R_LOmux + 100 Ω) ≈ 0.6 V with 500 Ω multiplexers, comfortably inside range. If the excitation current is reduced far below 1 mA, re-check that the common-mode floor is still met.</w:t>
+        <w:t xml:space="preserve"> R131 is doing two jobs. It is the intended current reference (0.01 % tolerance), and it lifts the sense nodes off ground so the ADC’s PGA sees a legal input. The ADS124S08 runs unipolar here (AVDD = +3V3, AVSS = GND). Per SBAS660C the PGA absolute input range is AVSS + 0.15 + |V_INMAX| × (Gain − 1) / 2 to AVDD − 0.15 − |V_INMAX| × (Gain − 1) / 2 for gain 1–16, and AVSS + 0.15 + 15.5 × |V_INMAX| to AVDD − 0.15 − 15.5 × |V_INMAX| for gain 32–128 — note the two ranges use DIFFERENT formulas. At 1 mA the LO_SENSE node sits at I × (R_LOmux + 100 Ω) ≈ 0.6 V with 500 Ω multiplexers, comfortably inside range at every gain. If the excitation current is reduced far below 1 mA, re-check the common-mode floor. Bypassing the PGA (PGA_EN = 00) removes the constraint altogether — the range becomes AVSS − 0.05 to AVDD + 0.05 — which is the right mode for a single-ended read such as the current-reference measurement in §7.2.</w:t>
       </w:r>
     </w:p>
     <w:p>
@@ -8317,7 +8317,7 @@
         <w:t xml:space="preserve">FIRMWARE REVIEW NOTE (v1.4) — HOW TO ENABLE METHOD B:</w:t>
       </w:r>
       <w:r>
-        <w:t xml:space="preserve"> Method B is not possible as drawn. LO_SENSE taps the LO[j] harness pin, which is above the low-side force multiplexer, so AIN1 measured against AINCOM gives I × (R_LOmux + R131) — the multiplexer resistance contaminates it. The fix is one net: bring the LO_COM node (the top of R131) to a spare ADC input; AIN2–AIN5 are all free. Firmware then reads AIN2–AINCOM single-ended, computes I = V / 100 Ω, and applies it to the differential Kelvin reading. A hardware-ratiometric variant — wiring REFP0 / REFN0 across R131 so the conversion itself is referenced to the shunt — is more elegant still, but the ADS124S08 external reference input has a minimum differential voltage of order 0.5 V and 1 mA × 100 Ω = 100 mV does not meet it. That route would need either a larger reference resistor or a much larger current, neither of which the 3.3 V compliance budget allows. Recommend the spare-analog-input approach.</w:t>
+        <w:t xml:space="preserve"> Method B is not possible as drawn. LO_SENSE taps the LO[j] harness pin, which is above the low-side force multiplexer, so AIN1 measured against AINCOM gives I × (R_LOmux + R131) — the multiplexer resistance contaminates it. The fix is one net: bring the LO_COM node (the top of R131) to a spare ADC input; AIN2–AIN5 are all free. Firmware then reads AIN2–AINCOM single-ended, computes I = V / 100 Ω, and applies it to the differential Kelvin reading. A hardware-ratiometric variant — wiring REFP0 / REFN0 across R131 so the conversion itself is referenced to the shunt — is more elegant still, but SBAS660C specifies a minimum differential external reference of 0.5 V and 1 mA × 100 Ω = 100 mV does not meet it. That route would need either a larger reference resistor or a much larger current, neither of which the 3.3 V compliance budget allows. Recommend the spare-analog-input approach.</w:t>
       </w:r>
     </w:p>
     <w:p/>

</xml_diff>